<commit_message>
Završi projektnu dokumentaciju sa GitHub linkom i screenshot-ima portala.
Dodaje booking screenshot, ažurira Word/PDF, GitHub URL u svim poglavljima i skriptu za snimanje stranica portala.

Co-authored-by: Cursor <cursoragent@cursor.com>
</commit_message>
<xml_diff>
--- a/docs/Space_For_Work_Projektna_Dokumentacija_2026.docx
+++ b/docs/Space_For_Work_Projektna_Dokumentacija_2026.docx
@@ -1272,6 +1272,47 @@
     <w:p>
       <w:pPr>
         <w:keepNext/>
+        <w:spacing w:before="200" w:after="160" w:line="252" w:lineRule="auto"/>
+      </w:pPr>
+      <w:r>
+        <w:rPr>
+          <w:rFonts w:ascii="Times New Roman" w:hAnsi="Times New Roman" w:eastAsia="Times New Roman"/>
+          <w:b/>
+          <w:i w:val="0"/>
+          <w:sz w:val="26"/>
+        </w:rPr>
+        <w:t>2.6. Izvorni kod i repozitorijum</w:t>
+      </w:r>
+    </w:p>
+    <w:p>
+      <w:pPr>
+        <w:spacing w:before="0" w:after="120" w:line="252" w:lineRule="auto"/>
+        <w:ind w:firstLine="340"/>
+      </w:pPr>
+      <w:r>
+        <w:rPr>
+          <w:rFonts w:ascii="Times New Roman" w:hAnsi="Times New Roman" w:eastAsia="Times New Roman"/>
+          <w:b w:val="0"/>
+          <w:i w:val="0"/>
+          <w:sz w:val="24"/>
+        </w:rPr>
+        <w:t>Kompletan izvorni kod, Docker konfiguracija, portal, dijagrami i generator projektne dokumentacije objavljeni su na GitHub repozitorijumu projekta. Repozitorijum služi kao centralno mesto za predaju, pregled implementacije i pokretanje sistema u lokalnom okruženju.</w:t>
+      </w:r>
+    </w:p>
+    <w:p>
+      <w:hyperlink r:id="rId11">
+        <w:r>
+          <w:rPr>
+            <w:color w:val="0563C1"/>
+            <w:u w:val="single"/>
+          </w:rPr>
+          <w:t>https://github.com/andjelalukicc/space-for-work</w:t>
+        </w:r>
+      </w:hyperlink>
+    </w:p>
+    <w:p>
+      <w:pPr>
+        <w:keepNext/>
         <w:spacing w:before="200" w:after="240" w:line="252" w:lineRule="auto"/>
       </w:pPr>
       <w:r>
@@ -2203,6 +2244,32 @@
     </w:p>
     <w:p>
       <w:pPr>
+        <w:spacing w:before="0" w:after="120" w:line="252" w:lineRule="auto"/>
+        <w:ind w:firstLine="340"/>
+      </w:pPr>
+      <w:r>
+        <w:rPr>
+          <w:rFonts w:ascii="Times New Roman" w:hAnsi="Times New Roman" w:eastAsia="Times New Roman"/>
+          <w:b w:val="0"/>
+          <w:i w:val="0"/>
+          <w:sz w:val="24"/>
+        </w:rPr>
+        <w:t>Izvorni kod, uputstvo za pokretanje i aktuelna verzija portala dostupni su na GitHub repozitorijumu projekta. Lokalni demo portal se pokreće preko HTTP servera i otvara se u browseru na adresi koja je navedena na naslovnoj strani dokumentacije.</w:t>
+      </w:r>
+    </w:p>
+    <w:p>
+      <w:hyperlink r:id="rId11">
+        <w:r>
+          <w:rPr>
+            <w:color w:val="0563C1"/>
+            <w:u w:val="single"/>
+          </w:rPr>
+          <w:t>GitHub repozitorijum — space-for-work</w:t>
+        </w:r>
+      </w:hyperlink>
+    </w:p>
+    <w:p>
+      <w:pPr>
         <w:keepNext/>
         <w:spacing w:before="200" w:after="160" w:line="252" w:lineRule="auto"/>
       </w:pPr>
@@ -2238,7 +2305,7 @@
       <w:r>
         <w:drawing>
           <wp:inline xmlns:a="http://schemas.openxmlformats.org/drawingml/2006/main" xmlns:pic="http://schemas.openxmlformats.org/drawingml/2006/picture">
-            <wp:extent cx="5580000" cy="3138750"/>
+            <wp:extent cx="5580000" cy="4650000"/>
             <wp:docPr id="6" name="Picture 6"/>
             <wp:cNvGraphicFramePr>
               <a:graphicFrameLocks noChangeAspect="1"/>
@@ -2259,7 +2326,7 @@
                   <pic:spPr>
                     <a:xfrm>
                       <a:off x="0" y="0"/>
-                      <a:ext cx="5580000" cy="3138750"/>
+                      <a:ext cx="5580000" cy="4650000"/>
                     </a:xfrm>
                     <a:prstGeom prst="rect"/>
                   </pic:spPr>
@@ -2309,7 +2376,7 @@
       <w:r>
         <w:drawing>
           <wp:inline xmlns:a="http://schemas.openxmlformats.org/drawingml/2006/main" xmlns:pic="http://schemas.openxmlformats.org/drawingml/2006/picture">
-            <wp:extent cx="5580000" cy="3138750"/>
+            <wp:extent cx="5580000" cy="4650000"/>
             <wp:docPr id="7" name="Picture 7"/>
             <wp:cNvGraphicFramePr>
               <a:graphicFrameLocks noChangeAspect="1"/>
@@ -2330,7 +2397,7 @@
                   <pic:spPr>
                     <a:xfrm>
                       <a:off x="0" y="0"/>
-                      <a:ext cx="5580000" cy="3138750"/>
+                      <a:ext cx="5580000" cy="4650000"/>
                     </a:xfrm>
                     <a:prstGeom prst="rect"/>
                   </pic:spPr>
@@ -2365,7 +2432,7 @@
       <w:r>
         <w:drawing>
           <wp:inline xmlns:a="http://schemas.openxmlformats.org/drawingml/2006/main" xmlns:pic="http://schemas.openxmlformats.org/drawingml/2006/picture">
-            <wp:extent cx="5580000" cy="3138750"/>
+            <wp:extent cx="5580000" cy="4650000"/>
             <wp:docPr id="8" name="Picture 8"/>
             <wp:cNvGraphicFramePr>
               <a:graphicFrameLocks noChangeAspect="1"/>
@@ -2386,7 +2453,7 @@
                   <pic:spPr>
                     <a:xfrm>
                       <a:off x="0" y="0"/>
-                      <a:ext cx="5580000" cy="3138750"/>
+                      <a:ext cx="5580000" cy="4650000"/>
                     </a:xfrm>
                     <a:prstGeom prst="rect"/>
                   </pic:spPr>
@@ -2461,6 +2528,62 @@
     </w:p>
     <w:p>
       <w:pPr>
+        <w:jc w:val="center"/>
+      </w:pPr>
+      <w:r>
+        <w:drawing>
+          <wp:inline xmlns:a="http://schemas.openxmlformats.org/drawingml/2006/main" xmlns:pic="http://schemas.openxmlformats.org/drawingml/2006/picture">
+            <wp:extent cx="5580000" cy="4650000"/>
+            <wp:docPr id="9" name="Picture 9"/>
+            <wp:cNvGraphicFramePr>
+              <a:graphicFrameLocks noChangeAspect="1"/>
+            </wp:cNvGraphicFramePr>
+            <a:graphic>
+              <a:graphicData uri="http://schemas.openxmlformats.org/drawingml/2006/picture">
+                <pic:pic>
+                  <pic:nvPicPr>
+                    <pic:cNvPr id="0" name="portal-booking.png"/>
+                    <pic:cNvPicPr/>
+                  </pic:nvPicPr>
+                  <pic:blipFill>
+                    <a:blip r:embed="rId19"/>
+                    <a:stretch>
+                      <a:fillRect/>
+                    </a:stretch>
+                  </pic:blipFill>
+                  <pic:spPr>
+                    <a:xfrm>
+                      <a:off x="0" y="0"/>
+                      <a:ext cx="5580000" cy="4650000"/>
+                    </a:xfrm>
+                    <a:prstGeom prst="rect"/>
+                  </pic:spPr>
+                </pic:pic>
+              </a:graphicData>
+            </a:graphic>
+          </wp:inline>
+        </w:drawing>
+      </w:r>
+    </w:p>
+    <w:p>
+      <w:pPr>
+        <w:keepNext w:val="0"/>
+        <w:spacing w:before="0" w:after="160" w:line="252" w:lineRule="auto"/>
+        <w:jc w:val="center"/>
+      </w:pPr>
+      <w:r>
+        <w:rPr>
+          <w:rFonts w:ascii="Times New Roman" w:hAnsi="Times New Roman" w:eastAsia="Times New Roman"/>
+          <w:b w:val="0"/>
+          <w:i/>
+          <w:color w:val="606060"/>
+          <w:sz w:val="20"/>
+        </w:rPr>
+        <w:t>Slika 7. Modul za rezervaciju sala i phone booth-ova</w:t>
+      </w:r>
+    </w:p>
+    <w:p>
+      <w:pPr>
         <w:keepNext/>
         <w:spacing w:before="200" w:after="160" w:line="252" w:lineRule="auto"/>
       </w:pPr>
@@ -2496,8 +2619,8 @@
       <w:r>
         <w:drawing>
           <wp:inline xmlns:a="http://schemas.openxmlformats.org/drawingml/2006/main" xmlns:pic="http://schemas.openxmlformats.org/drawingml/2006/picture">
-            <wp:extent cx="5580000" cy="3138750"/>
-            <wp:docPr id="9" name="Picture 9"/>
+            <wp:extent cx="5580000" cy="4650000"/>
+            <wp:docPr id="10" name="Picture 10"/>
             <wp:cNvGraphicFramePr>
               <a:graphicFrameLocks noChangeAspect="1"/>
             </wp:cNvGraphicFramePr>
@@ -2509,7 +2632,7 @@
                     <pic:cNvPicPr/>
                   </pic:nvPicPr>
                   <pic:blipFill>
-                    <a:blip r:embed="rId19"/>
+                    <a:blip r:embed="rId20"/>
                     <a:stretch>
                       <a:fillRect/>
                     </a:stretch>
@@ -2517,7 +2640,7 @@
                   <pic:spPr>
                     <a:xfrm>
                       <a:off x="0" y="0"/>
-                      <a:ext cx="5580000" cy="3138750"/>
+                      <a:ext cx="5580000" cy="4650000"/>
                     </a:xfrm>
                     <a:prstGeom prst="rect"/>
                   </pic:spPr>
@@ -2542,7 +2665,7 @@
           <w:color w:val="606060"/>
           <w:sz w:val="20"/>
         </w:rPr>
-        <w:t>Slika 7. Administratorska kontrolna tabla</w:t>
+        <w:t>Slika 8. Administratorska kontrolna tabla</w:t>
       </w:r>
     </w:p>
     <w:p>
@@ -2793,7 +2916,7 @@
         <w:drawing>
           <wp:inline xmlns:a="http://schemas.openxmlformats.org/drawingml/2006/main" xmlns:pic="http://schemas.openxmlformats.org/drawingml/2006/picture">
             <wp:extent cx="5112000" cy="3937769"/>
-            <wp:docPr id="10" name="Picture 10"/>
+            <wp:docPr id="11" name="Picture 11"/>
             <wp:cNvGraphicFramePr>
               <a:graphicFrameLocks noChangeAspect="1"/>
             </wp:cNvGraphicFramePr>
@@ -2805,7 +2928,7 @@
                     <pic:cNvPicPr/>
                   </pic:nvPicPr>
                   <pic:blipFill>
-                    <a:blip r:embed="rId20"/>
+                    <a:blip r:embed="rId21"/>
                     <a:stretch>
                       <a:fillRect/>
                     </a:stretch>
@@ -2838,7 +2961,7 @@
           <w:color w:val="606060"/>
           <w:sz w:val="20"/>
         </w:rPr>
-        <w:t>Slika 8. Tok plaćanja i webhook potvrde</w:t>
+        <w:t>Slika 9. Tok plaćanja i webhook potvrde</w:t>
       </w:r>
     </w:p>
     <w:p>

</xml_diff>